<commit_message>
Fix KeyError in test_script.py and update gitignore
</commit_message>
<xml_diff>
--- a/output/test_output_final_formatted_agendas.docx
+++ b/output/test_output_final_formatted_agendas.docx
@@ -46,8 +46,6 @@
                 <w:szCs w:val="48"/>
               </w:rPr>
             </w:pPr>
-            <w:proofErr w:type="spellStart"/>
-            <w:proofErr w:type="spellEnd"/>
             <w:r>
               <w:rPr>
                 <w:rFonts w:eastAsia="標楷體"/>
@@ -151,7 +149,6 @@
                 <w:szCs w:val="28"/>
               </w:rPr>
             </w:pPr>
-            <w:proofErr w:type="gramStart"/>
             <w:r>
               <w:rPr>
                 <w:rFonts w:eastAsia="標楷體" w:hAnsi="標楷體"/>
@@ -161,7 +158,6 @@
               </w:rPr>
               <w:t>一</w:t>
             </w:r>
-            <w:proofErr w:type="gramEnd"/>
             <w:r>
               <w:rPr>
                 <w:rFonts w:eastAsia="標楷體"/>
@@ -1129,27 +1125,7 @@
                 <w:sz w:val="28"/>
                 <w:szCs w:val="28"/>
               </w:rPr>
-              <w:t>選出</w:t>
-            </w:r>
-            <w:proofErr w:type="gramStart"/>
-            <w:r>
-              <w:rPr>
-                <w:rFonts w:eastAsia="標楷體" w:hAnsi="標楷體" w:hint="eastAsia"/>
-                <w:color w:val="000000"/>
-                <w:sz w:val="28"/>
-                <w:szCs w:val="28"/>
-              </w:rPr>
-              <w:t>三</w:t>
-            </w:r>
-            <w:proofErr w:type="gramEnd"/>
-            <w:r>
-              <w:rPr>
-                <w:rFonts w:eastAsia="標楷體" w:hAnsi="標楷體" w:hint="eastAsia"/>
-                <w:color w:val="000000"/>
-                <w:sz w:val="28"/>
-                <w:szCs w:val="28"/>
-              </w:rPr>
-              <w:t>席董事及一席監察人，任期三年，自改選之日起算</w:t>
+              <w:t>選出三席董事及一席監察人，任期三年，自改選之日起算</w:t>
             </w:r>
             <w:r>
               <w:rPr>
@@ -1808,9 +1784,9 @@
         <w:tblLook w:val="04A0" w:firstRow="1" w:lastRow="0" w:firstColumn="1" w:lastColumn="0" w:noHBand="0" w:noVBand="1"/>
       </w:tblPr>
       <w:tblGrid>
-        <w:gridCol w:w="2837"/>
-        <w:gridCol w:w="1302"/>
-        <w:gridCol w:w="5409"/>
+        <w:gridCol w:w="1304"/>
+        <w:gridCol w:w="992"/>
+        <w:gridCol w:w="7252"/>
       </w:tblGrid>
       <w:tr>
         <w:tc>
@@ -1836,7 +1812,6 @@
               </w:rPr>
               <w:t>{{</w:t>
             </w:r>
-            <w:proofErr w:type="spellStart"/>
             <w:r>
               <w:rPr>
                 <w:rFonts w:eastAsia="標楷體"/>
@@ -1867,16 +1842,7 @@
                 <w:sz w:val="28"/>
                 <w:szCs w:val="28"/>
               </w:rPr>
-              <w:t>_table</w:t>
-            </w:r>
-            <w:proofErr w:type="spellEnd"/>
-            <w:r>
-              <w:rPr>
-                <w:rFonts w:eastAsia="標楷體" w:hint="eastAsia"/>
-                <w:sz w:val="28"/>
-                <w:szCs w:val="28"/>
-              </w:rPr>
-              <w:t>}}</w:t>
+              <w:t>_table}}</w:t>
             </w:r>
           </w:p>
         </w:tc>
@@ -1884,7 +1850,7 @@
       <w:tr>
         <w:tc>
           <w:tcPr>
-            <w:tcW w:w="2837" w:type="dxa"/>
+            <w:tcW w:w="1304" w:type="dxa"/>
           </w:tcPr>
           <w:p>
             <w:pPr>
@@ -1906,31 +1872,31 @@
         </w:tc>
         <w:tc>
           <w:tcPr>
-            <w:tcW w:w="1302" w:type="dxa"/>
+            <w:tcW w:w="992" w:type="dxa"/>
           </w:tcPr>
           <w:p>
             <w:pPr>
               <w:snapToGrid w:val="0"/>
               <w:spacing w:line="240" w:lineRule="atLeast"/>
               <w:rPr>
+                <w:rFonts w:eastAsia="標楷體"/>
+                <w:sz w:val="28"/>
+                <w:szCs w:val="28"/>
+              </w:rPr>
+            </w:pPr>
+            <w:r>
+              <w:rPr>
                 <w:rFonts w:eastAsia="標楷體" w:hint="eastAsia"/>
                 <w:sz w:val="28"/>
                 <w:szCs w:val="28"/>
               </w:rPr>
-            </w:pPr>
-            <w:r>
-              <w:rPr>
-                <w:rFonts w:eastAsia="標楷體" w:hint="eastAsia"/>
-                <w:sz w:val="28"/>
-                <w:szCs w:val="28"/>
-              </w:rPr>
               <w:t>案由：</w:t>
             </w:r>
           </w:p>
         </w:tc>
         <w:tc>
           <w:tcPr>
-            <w:tcW w:w="5409" w:type="dxa"/>
+            <w:tcW w:w="7252" w:type="dxa"/>
           </w:tcPr>
           <w:p>
             <w:pPr>
@@ -1955,7 +1921,7 @@
       <w:tr>
         <w:tc>
           <w:tcPr>
-            <w:tcW w:w="2837" w:type="dxa"/>
+            <w:tcW w:w="1304" w:type="dxa"/>
           </w:tcPr>
           <w:p>
             <w:pPr>
@@ -1971,7 +1937,7 @@
         </w:tc>
         <w:tc>
           <w:tcPr>
-            <w:tcW w:w="1302" w:type="dxa"/>
+            <w:tcW w:w="992" w:type="dxa"/>
           </w:tcPr>
           <w:p>
             <w:pPr>
@@ -1995,7 +1961,7 @@
         </w:tc>
         <w:tc>
           <w:tcPr>
-            <w:tcW w:w="5409" w:type="dxa"/>
+            <w:tcW w:w="7252" w:type="dxa"/>
           </w:tcPr>
           <w:p>
             <w:pPr>
@@ -2020,7 +1986,7 @@
       <w:tr>
         <w:tc>
           <w:tcPr>
-            <w:tcW w:w="2837" w:type="dxa"/>
+            <w:tcW w:w="1304" w:type="dxa"/>
           </w:tcPr>
           <w:p>
             <w:pPr>
@@ -2036,7 +2002,7 @@
         </w:tc>
         <w:tc>
           <w:tcPr>
-            <w:tcW w:w="1302" w:type="dxa"/>
+            <w:tcW w:w="992" w:type="dxa"/>
           </w:tcPr>
           <w:p>
             <w:pPr>
@@ -2060,7 +2026,7 @@
         </w:tc>
         <w:tc>
           <w:tcPr>
-            <w:tcW w:w="5409" w:type="dxa"/>
+            <w:tcW w:w="7252" w:type="dxa"/>
           </w:tcPr>
           <w:p>
             <w:pPr>
@@ -2091,7 +2057,7 @@
       <w:tr>
         <w:tc>
           <w:tcPr>
-            <w:tcW w:w="2837" w:type="dxa"/>
+            <w:tcW w:w="1304" w:type="dxa"/>
           </w:tcPr>
           <w:p>
             <w:pPr>
@@ -2113,31 +2079,31 @@
         </w:tc>
         <w:tc>
           <w:tcPr>
-            <w:tcW w:w="1302" w:type="dxa"/>
+            <w:tcW w:w="992" w:type="dxa"/>
           </w:tcPr>
           <w:p>
             <w:pPr>
               <w:snapToGrid w:val="0"/>
               <w:spacing w:line="240" w:lineRule="atLeast"/>
               <w:rPr>
+                <w:rFonts w:eastAsia="標楷體"/>
+                <w:sz w:val="28"/>
+                <w:szCs w:val="28"/>
+              </w:rPr>
+            </w:pPr>
+            <w:r>
+              <w:rPr>
                 <w:rFonts w:eastAsia="標楷體" w:hint="eastAsia"/>
                 <w:sz w:val="28"/>
                 <w:szCs w:val="28"/>
               </w:rPr>
-            </w:pPr>
-            <w:r>
-              <w:rPr>
-                <w:rFonts w:eastAsia="標楷體" w:hint="eastAsia"/>
-                <w:sz w:val="28"/>
-                <w:szCs w:val="28"/>
-              </w:rPr>
               <w:t>案由：</w:t>
             </w:r>
           </w:p>
         </w:tc>
         <w:tc>
           <w:tcPr>
-            <w:tcW w:w="5409" w:type="dxa"/>
+            <w:tcW w:w="7252" w:type="dxa"/>
           </w:tcPr>
           <w:p>
             <w:pPr>
@@ -2162,7 +2128,7 @@
       <w:tr>
         <w:tc>
           <w:tcPr>
-            <w:tcW w:w="2837" w:type="dxa"/>
+            <w:tcW w:w="1304" w:type="dxa"/>
           </w:tcPr>
           <w:p>
             <w:pPr>
@@ -2178,7 +2144,7 @@
         </w:tc>
         <w:tc>
           <w:tcPr>
-            <w:tcW w:w="1302" w:type="dxa"/>
+            <w:tcW w:w="992" w:type="dxa"/>
           </w:tcPr>
           <w:p>
             <w:pPr>
@@ -2202,7 +2168,7 @@
         </w:tc>
         <w:tc>
           <w:tcPr>
-            <w:tcW w:w="5409" w:type="dxa"/>
+            <w:tcW w:w="7252" w:type="dxa"/>
           </w:tcPr>
           <w:p>
             <w:pPr>
@@ -2227,7 +2193,7 @@
       <w:tr>
         <w:tc>
           <w:tcPr>
-            <w:tcW w:w="2837" w:type="dxa"/>
+            <w:tcW w:w="1304" w:type="dxa"/>
           </w:tcPr>
           <w:p>
             <w:pPr>
@@ -2243,7 +2209,7 @@
         </w:tc>
         <w:tc>
           <w:tcPr>
-            <w:tcW w:w="1302" w:type="dxa"/>
+            <w:tcW w:w="992" w:type="dxa"/>
           </w:tcPr>
           <w:p>
             <w:pPr>
@@ -2267,7 +2233,7 @@
         </w:tc>
         <w:tc>
           <w:tcPr>
-            <w:tcW w:w="5409" w:type="dxa"/>
+            <w:tcW w:w="7252" w:type="dxa"/>
           </w:tcPr>
           <w:p>
             <w:pPr>
@@ -2317,7 +2283,7 @@
         <w:snapToGrid w:val="0"/>
         <w:spacing w:line="240" w:lineRule="atLeast"/>
         <w:rPr>
-          <w:rFonts w:eastAsia="標楷體" w:hint="eastAsia"/>
+          <w:rFonts w:eastAsia="標楷體"/>
           <w:sz w:val="28"/>
           <w:szCs w:val="28"/>
         </w:rPr>
@@ -2398,8 +2364,6 @@
                 <w:szCs w:val="48"/>
               </w:rPr>
             </w:pPr>
-            <w:proofErr w:type="spellStart"/>
-            <w:proofErr w:type="spellEnd"/>
             <w:r>
               <w:rPr>
                 <w:rFonts w:ascii="標楷體" w:hAnsi="標楷體" w:eastAsia="標楷體"/>
@@ -2454,7 +2418,6 @@
                 <w:szCs w:val="26"/>
               </w:rPr>
             </w:pPr>
-            <w:proofErr w:type="gramStart"/>
             <w:r>
               <w:rPr>
                 <w:rFonts w:eastAsia="標楷體" w:hAnsi="標楷體"/>
@@ -2464,7 +2427,6 @@
               </w:rPr>
               <w:t>一</w:t>
             </w:r>
-            <w:proofErr w:type="gramEnd"/>
             <w:r>
               <w:rPr>
                 <w:rFonts w:eastAsia="標楷體"/>
@@ -3416,18 +3378,8 @@
                 <w:sz w:val="26"/>
                 <w:szCs w:val="26"/>
               </w:rPr>
-              <w:t>(1)</w:t>
-            </w:r>
-            <w:proofErr w:type="gramStart"/>
-            <w:r>
-              <w:rPr>
-                <w:rFonts w:ascii="標楷體" w:eastAsia="標楷體" w:hAnsi="標楷體" w:hint="eastAsia"/>
-                <w:sz w:val="26"/>
-                <w:szCs w:val="26"/>
-              </w:rPr>
-              <w:t>本次擬增資</w:t>
-            </w:r>
-            <w:proofErr w:type="gramEnd"/>
+              <w:t>(1)本次擬增資</w:t>
+            </w:r>
             <w:r>
               <w:rPr>
                 <w:rFonts w:ascii="標楷體" w:eastAsia="標楷體" w:hAnsi="標楷體" w:hint="eastAsia"/>
@@ -3551,25 +3503,7 @@
                 <w:sz w:val="26"/>
                 <w:szCs w:val="26"/>
               </w:rPr>
-              <w:t>發行，除依法保留10%由員工認股外，餘由股東依持股比例</w:t>
-            </w:r>
-            <w:proofErr w:type="gramStart"/>
-            <w:r>
-              <w:rPr>
-                <w:rFonts w:ascii="標楷體" w:eastAsia="標楷體" w:hAnsi="標楷體" w:hint="eastAsia"/>
-                <w:sz w:val="26"/>
-                <w:szCs w:val="26"/>
-              </w:rPr>
-              <w:t>優先分認</w:t>
-            </w:r>
-            <w:proofErr w:type="gramEnd"/>
-            <w:r>
-              <w:rPr>
-                <w:rFonts w:ascii="標楷體" w:eastAsia="標楷體" w:hAnsi="標楷體" w:hint="eastAsia"/>
-                <w:sz w:val="26"/>
-                <w:szCs w:val="26"/>
-              </w:rPr>
-              <w:t>，期限內未認股繳款者視為棄權，授權董事長洽特定人認足，茲擬定相關日期如下:</w:t>
+              <w:t>發行，除依法保留10%由員工認股外，餘由股東依持股比例優先分認，期限內未認股繳款者視為棄權，授權董事長洽特定人認足，茲擬定相關日期如下:</w:t>
             </w:r>
           </w:p>
           <w:p>
@@ -4355,8 +4289,6 @@
           <w:szCs w:val="48"/>
         </w:rPr>
       </w:pPr>
-      <w:proofErr w:type="spellStart"/>
-      <w:proofErr w:type="spellEnd"/>
       <w:r>
         <w:rPr>
           <w:rFonts w:eastAsia="標楷體"/>
@@ -4509,25 +4441,7 @@
           <w:sz w:val="28"/>
           <w:szCs w:val="28"/>
         </w:rPr>
-        <w:t>四、委託人所稱之事實，</w:t>
-      </w:r>
-      <w:proofErr w:type="gramStart"/>
-      <w:r>
-        <w:rPr>
-          <w:rFonts w:eastAsia="標楷體" w:hint="eastAsia"/>
-          <w:sz w:val="28"/>
-          <w:szCs w:val="28"/>
-        </w:rPr>
-        <w:t>均係正確</w:t>
-      </w:r>
-      <w:proofErr w:type="gramEnd"/>
-      <w:r>
-        <w:rPr>
-          <w:rFonts w:eastAsia="標楷體" w:hint="eastAsia"/>
-          <w:sz w:val="28"/>
-          <w:szCs w:val="28"/>
-        </w:rPr>
-        <w:t>，如有虛偽不實等情事一經發現受任人得隨時終止本約。所有約定酬金及受任人因處理委託事務所墊付之費用，仍應付清，如委任事務終了後發現有虛偽不實等情事所衍生的民、刑事責任完全由委任人負責之。</w:t>
+        <w:t>四、委託人所稱之事實，均係正確，如有虛偽不實等情事一經發現受任人得隨時終止本約。所有約定酬金及受任人因處理委託事務所墊付之費用，仍應付清，如委任事務終了後發現有虛偽不實等情事所衍生的民、刑事責任完全由委任人負責之。</w:t>
       </w:r>
     </w:p>
     <w:p>
@@ -4578,8 +4492,6 @@
           <w:szCs w:val="28"/>
         </w:rPr>
       </w:pPr>
-      <w:proofErr w:type="spellStart"/>
-      <w:proofErr w:type="spellEnd"/>
       <w:r>
         <w:rPr>
           <w:rFonts w:eastAsia="標楷體"/>
@@ -4598,8 +4510,6 @@
           <w:szCs w:val="28"/>
         </w:rPr>
       </w:pPr>
-      <w:proofErr w:type="spellStart"/>
-      <w:proofErr w:type="spellEnd"/>
       <w:r>
         <w:rPr>
           <w:rFonts w:eastAsia="標楷體"/>
@@ -4704,25 +4614,7 @@
           <w:sz w:val="28"/>
           <w:szCs w:val="28"/>
         </w:rPr>
-        <w:t>事務所地址：</w:t>
-      </w:r>
-      <w:proofErr w:type="gramStart"/>
-      <w:r>
-        <w:rPr>
-          <w:rFonts w:eastAsia="標楷體" w:hint="eastAsia"/>
-          <w:sz w:val="28"/>
-          <w:szCs w:val="28"/>
-        </w:rPr>
-        <w:t>臺</w:t>
-      </w:r>
-      <w:proofErr w:type="gramEnd"/>
-      <w:r>
-        <w:rPr>
-          <w:rFonts w:eastAsia="標楷體" w:hint="eastAsia"/>
-          <w:sz w:val="28"/>
-          <w:szCs w:val="28"/>
-        </w:rPr>
-        <w:t>中市西區五權路</w:t>
+        <w:t>事務所地址：臺中市西區五權路</w:t>
       </w:r>
       <w:r>
         <w:rPr>

</xml_diff>